<commit_message>
docs: update FlowMind AI 8-Week Project Progress Report Word document with Week 5 Business Suite
</commit_message>
<xml_diff>
--- a/FlowMind_AI_8_Week_Project_Progress_Report.docx
+++ b/FlowMind_AI_8_Week_Project_Progress_Report.docx
@@ -766,7 +766,7 @@
                 <w:color w:val="1E293B"/>
                 <w:sz w:val="19"/>
               </w:rPr>
-              <w:t>Weeks 1–5 COMPLETED IMPLEMENTATION (INCL. POSTGRESQL &amp; PRISMA ORM)</w:t>
+              <w:t>Weeks 1–5 COMPLETED IMPLEMENTATION (INTEGRATED BUSINESS OPERATIONS SUITE: CRM, HR, FINANCE, INVENTORY, SUPPORT &amp; POSTGRESQL 22-MODEL LAYER)</w:t>
             </w:r>
           </w:p>
         </w:tc>
@@ -823,7 +823,7 @@
                 <w:color w:val="1E293B"/>
                 <w:sz w:val="21"/>
               </w:rPr>
-              <w:t>This Interim Progress Report documents the complete architectural design and verified implementation of FlowMind AI across Weeks 1 to 5. Key achievements include the 15-Agent Mesh Collaboration, Multilingual Indic Engine (6 scripts), Zero-Code Natural Language Workflow DAG Automation Engine, Action Governance (HITL), and the fully integrated Enterprise PostgreSQL + Prisma ORM Persistence Layer with 3-Tier RBAC.</w:t>
+              <w:t>This Interim Progress Report documents the complete architectural design and verified implementation of FlowMind AI across Weeks 1 to 5. Key achievements include the 15-Agent Mesh Collaboration, Multilingual Indic Engine (7 languages), Zero-Code Natural Language Workflow DAG Automation Engine, Action Governance (HITL), the fully integrated Enterprise PostgreSQL + Prisma ORM Persistence Layer with 22 Relational Models, and the complete Integrated Business Operations Suite covering CRM, HR (with salary masking &amp; anti-self-approval), Finance (with 18% GST invoicing), Inventory (with stock movements &amp; reorder alerts), and Support (with SLA queue &amp; notes).</w:t>
             </w:r>
           </w:p>
         </w:tc>
@@ -877,7 +877,7 @@
           <w:color w:val="1E293B"/>
           <w:sz w:val="22"/>
         </w:rPr>
-        <w:t>Modern enterprise platforms often impose steep learning curves, complex UI navigation, and technical scripting requirements. FlowMind AI resolves these barriers by orchestrating a 15-Agent Mesh, an Indic Multilingual Engine supporting 6 language scripts, a zero-code Workflow Automation DAG Engine, and a robust PostgreSQL relational persistence layer.</w:t>
+        <w:t>Modern enterprise platforms often impose steep learning curves, complex UI navigation, and technical scripting requirements across disconnected silos. FlowMind AI resolves these barriers by orchestrating a 15-Agent Mesh, an Indic Multilingual Engine, a zero-code Workflow Automation DAG Engine, a robust PostgreSQL relational persistence layer with 22 models, and an integrated Business Operations Suite spanning CRM, HR, Finance, Inventory, and Support.</w:t>
       </w:r>
     </w:p>
     <w:p>
@@ -985,7 +985,7 @@
           <w:color w:val="0F172A"/>
           <w:sz w:val="22"/>
         </w:rPr>
-        <w:t xml:space="preserve">4. Ephemeral Storage &amp; Lack of Audit Trails: </w:t>
+        <w:t xml:space="preserve">4. Ephemeral Storage &amp; Disconnected Silos: </w:t>
       </w:r>
       <w:r>
         <w:rPr>
@@ -993,7 +993,7 @@
           <w:color w:val="1E293B"/>
           <w:sz w:val="22"/>
         </w:rPr>
-        <w:t>Traditional systems lack structured state persistence, relational multi-tenant isolation, and audit trail capabilities.</w:t>
+        <w:t>Traditional systems operate as fragmented silos lacking unified persistence, cross-module context, and structured audit trail capabilities.</w:t>
       </w:r>
     </w:p>
     <w:p>
@@ -1065,7 +1065,7 @@
           <w:color w:val="1E293B"/>
           <w:sz w:val="22"/>
         </w:rPr>
-        <w:t>Build an Indic Engine supporting English, Telugu, Hindi, Tamil, Kannada, and Malayalam with Web Speech STT/TTS voice synthesis.</w:t>
+        <w:t>Build an Indic Engine supporting English, Telugu, Hindi, Tamil, Kannada, Malayalam, and Odia with Web Speech STT/TTS voice synthesis.</w:t>
       </w:r>
     </w:p>
     <w:p>
@@ -1145,7 +1145,7 @@
           <w:color w:val="0F172A"/>
           <w:sz w:val="22"/>
         </w:rPr>
-        <w:t xml:space="preserve">• Objective 6 (PostgreSQL &amp; Prisma ORM Layer - COMPLETED): </w:t>
+        <w:t xml:space="preserve">• Objective 6 (Integrated Business Operations &amp; PostgreSQL Persistence - COMPLETED): </w:t>
       </w:r>
       <w:r>
         <w:rPr>
@@ -1153,7 +1153,7 @@
           <w:color w:val="1E293B"/>
           <w:sz w:val="22"/>
         </w:rPr>
-        <w:t>Implement a complete enterprise PostgreSQL database persistence layer backed by Prisma ORM, multi-tenant isolation, and 3-tier Role-Based Access Control (ADMIN, MANAGER, EMPLOYEE).</w:t>
+        <w:t>Build an Integrated Enterprise Business Operations Suite (CRM, HR, Finance, Inventory, Support) backed by 22 PostgreSQL relational models, Prisma ORM, and 3-Tier RBAC with strict confidential data masking and anti-self-approval governance.</w:t>
       </w:r>
     </w:p>
     <w:p>
@@ -4651,7 +4651,7 @@
           <w:color w:val="1B365D"/>
           <w:sz w:val="32"/>
         </w:rPr>
-        <w:t>9.5. Week 5 Progress — PostgreSQL Database &amp; Prisma ORM Persistence Architecture</w:t>
+        <w:t>9.5. Week 5 Progress — Integrated Enterprise Business Operations Suite &amp; Database Layer</w:t>
       </w:r>
     </w:p>
     <w:p>
@@ -4664,7 +4664,7 @@
           <w:color w:val="1E293B"/>
           <w:sz w:val="22"/>
         </w:rPr>
-        <w:t>Week 5 achieved a major engineering milestone by transitioning FlowMind AI from prototype in-memory storage into a production-grade PostgreSQL database persistent application managed via Prisma ORM.</w:t>
+        <w:t>Week 5 achieved a transformative architectural milestone by expanding FlowMind AI from an autonomous workflow engine into a unified, production-grade Enterprise Business Operating System. Rather than isolated CRUD apps, five core enterprise domains—CRM, HR, Finance, Inventory, and Support—are directly integrated with PostgreSQL persistence, the 15-Agent Swarm, and DAG workflows.</w:t>
       </w:r>
     </w:p>
     <w:p>
@@ -4719,7 +4719,7 @@
           <w:color w:val="475569"/>
           <w:sz w:val="19"/>
         </w:rPr>
-        <w:t>Figure 10. Relational Enterprise PostgreSQL Database &amp; Prisma ORM Architecture Diagram</w:t>
+        <w:t>Figure 10. Relational Enterprise PostgreSQL Database &amp; Prisma ORM Architecture Diagram (22 Relational Models)</w:t>
       </w:r>
     </w:p>
     <w:p>
@@ -4734,7 +4734,7 @@
           <w:color w:val="0F172A"/>
           <w:sz w:val="26"/>
         </w:rPr>
-        <w:t>Key Week 5 Implementation Deliverables</w:t>
+        <w:t>Core Business Operations Modules Implemented in Week 5</w:t>
       </w:r>
     </w:p>
     <w:p>
@@ -4748,7 +4748,7 @@
           <w:color w:val="0F172A"/>
           <w:sz w:val="22"/>
         </w:rPr>
-        <w:t xml:space="preserve">• Prisma Schema Definition (prisma/schema.prisma): </w:t>
+        <w:t xml:space="preserve">1. Command Center Hub: </w:t>
       </w:r>
       <w:r>
         <w:rPr>
@@ -4756,7 +4756,7 @@
           <w:color w:val="1E293B"/>
           <w:sz w:val="22"/>
         </w:rPr>
-        <w:t>13 enterprise relational models including Organization, Permission, User, Workflow, WorkflowVersion, WorkflowExecution, WorkflowNodeExecution, Agent, AgentTask, ApprovalRequest, AuditLog, Artifact, Conversation, and Message.</w:t>
+        <w:t>Executive dashboard (/modules) featuring 6 cross-domain operational metrics, data-driven FlowMind Insights, quick operational triggers, and multi-entity global search across leads, staff, invoices, and tickets.</w:t>
       </w:r>
     </w:p>
     <w:p>
@@ -4770,7 +4770,7 @@
           <w:color w:val="0F172A"/>
           <w:sz w:val="22"/>
         </w:rPr>
-        <w:t xml:space="preserve">• 3-Tier RBAC &amp; Permissions Matrix (rbacService.ts): </w:t>
+        <w:t xml:space="preserve">2. CRM Suite: </w:t>
       </w:r>
       <w:r>
         <w:rPr>
@@ -4778,7 +4778,7 @@
           <w:color w:val="1E293B"/>
           <w:sz w:val="22"/>
         </w:rPr>
-        <w:t>Centralized 20 granular permission codes mapping ADMIN, MANAGER, and EMPLOYEE roles, featuring strict self-approval prevention (canUserApproveAction).</w:t>
+        <w:t>Visual pipeline board (/modules/crm) with 7 distinct stages (NEW, CONTACTED, QUALIFIED, PROPOSAL, NEGOTIATION, WON, LOST), automated lead scoring (1-100), stage history audit logging, and sliding Customer 360 Drawer.</w:t>
       </w:r>
     </w:p>
     <w:p>
@@ -4792,7 +4792,7 @@
           <w:color w:val="0F172A"/>
           <w:sz w:val="22"/>
         </w:rPr>
-        <w:t xml:space="preserve">• Service Repository Layer (userService, workflowService, agentService, approvalService, auditService): </w:t>
+        <w:t xml:space="preserve">3. HR &amp; Workforce Hub: </w:t>
       </w:r>
       <w:r>
         <w:rPr>
@@ -4800,7 +4800,7 @@
           <w:color w:val="1E293B"/>
           <w:sz w:val="22"/>
         </w:rPr>
-        <w:t>Service layer modules wrapping Prisma queries with fallback mechanisms to guarantee system uptime.</w:t>
+        <w:t>Staff directory (/modules/hr) with strict service-level salary masking (EMPLOYEE role sees '🔒 Restricted' / 0), leave request submission, leave approval queue with anti-self-approval enforcement, and an on-demand October 2026 payroll engine.</w:t>
       </w:r>
     </w:p>
     <w:p>
@@ -4814,7 +4814,7 @@
           <w:color w:val="0F172A"/>
           <w:sz w:val="22"/>
         </w:rPr>
-        <w:t xml:space="preserve">• Database Seeding Infrastructure (prisma/seed.ts): </w:t>
+        <w:t xml:space="preserve">4. Finance &amp; Billing Hub: </w:t>
       </w:r>
       <w:r>
         <w:rPr>
@@ -4822,7 +4822,7 @@
           <w:color w:val="1E293B"/>
           <w:sz w:val="22"/>
         </w:rPr>
-        <w:t>Pre-configures FlowMind Enterprise (ORG-01), 3 development role users (admin@flowmind.ai, manager@flowmind.ai, employee@flowmind.ai), 15 AI agents, and initial sample DAG workflows.</w:t>
+        <w:t>Invoice ledger (/modules/finance) managing DRAFT, PENDING, APPROVED, SENT, PAID, and OVERDUE states with automatic 18% GST calculation, single-click payment settlement, printable HTML preview, and PDF downloads.</w:t>
       </w:r>
     </w:p>
     <w:p>
@@ -4836,7 +4836,7 @@
           <w:color w:val="0F172A"/>
           <w:sz w:val="22"/>
         </w:rPr>
-        <w:t xml:space="preserve">• API &amp; Execution Engine Integration: </w:t>
+        <w:t xml:space="preserve">5. Inventory &amp; Warehousing: </w:t>
       </w:r>
       <w:r>
         <w:rPr>
@@ -4844,7 +4844,154 @@
           <w:color w:val="1E293B"/>
           <w:sz w:val="22"/>
         </w:rPr>
-        <w:t>Updated /api/auth/login, /api/auth/signup, /api/auth/me, /api/workflows, and workflowEngine runner to persist live execution runs.</w:t>
+        <w:t>Hardware SKU catalog (/modules/inventory) tracking quantities, unit prices, and reorder levels. Supports STOCK_IN, STOCK_OUT, and ADJUSTMENT movements with automatic low-stock alert triggers.</w:t>
+      </w:r>
+    </w:p>
+    <w:p>
+      <w:pPr>
+        <w:spacing w:before="0" w:after="120" w:line="276" w:lineRule="auto"/>
+      </w:pPr>
+      <w:r>
+        <w:rPr>
+          <w:rFonts w:ascii="Calibri" w:hAnsi="Calibri"/>
+          <w:b/>
+          <w:color w:val="0F172A"/>
+          <w:sz w:val="22"/>
+        </w:rPr>
+        <w:t xml:space="preserve">6. Support Helpdesk: </w:t>
+      </w:r>
+      <w:r>
+        <w:rPr>
+          <w:rFonts w:ascii="Calibri" w:hAnsi="Calibri"/>
+          <w:color w:val="1E293B"/>
+          <w:sz w:val="22"/>
+        </w:rPr>
+        <w:t>Helpdesk queue (/modules/support) categorized by SLA priorities (LOW, MEDIUM, HIGH, CRITICAL). Operators can create tickets, review details in a slide-out drawer, and log timestamped resolution notes.</w:t>
+      </w:r>
+    </w:p>
+    <w:p>
+      <w:pPr>
+        <w:keepNext/>
+        <w:spacing w:before="240" w:after="80"/>
+      </w:pPr>
+      <w:r>
+        <w:rPr>
+          <w:rFonts w:ascii="Calibri" w:hAnsi="Calibri"/>
+          <w:b/>
+          <w:color w:val="0F172A"/>
+          <w:sz w:val="26"/>
+        </w:rPr>
+        <w:t>Database Persistence, Security &amp; Cross-Module Intelligence</w:t>
+      </w:r>
+    </w:p>
+    <w:p>
+      <w:pPr>
+        <w:spacing w:before="0" w:after="120" w:line="276" w:lineRule="auto"/>
+      </w:pPr>
+      <w:r>
+        <w:rPr>
+          <w:rFonts w:ascii="Calibri" w:hAnsi="Calibri"/>
+          <w:b/>
+          <w:color w:val="0F172A"/>
+          <w:sz w:val="22"/>
+        </w:rPr>
+        <w:t xml:space="preserve">• 22 Relational Database Models (prisma/schema.prisma): </w:t>
+      </w:r>
+      <w:r>
+        <w:rPr>
+          <w:rFonts w:ascii="Calibri" w:hAnsi="Calibri"/>
+          <w:color w:val="1E293B"/>
+          <w:sz w:val="22"/>
+        </w:rPr>
+        <w:t>Engineered 12 new relational models (Lead, LeadStageHistory, Employee, LeaveRequest, PayrollRecord, Invoice, InvoiceItem, Payment, Product, StockMovement, SupportTicket, TicketNote), bringing the total relational schema to 22 models with composite indexes on tenant and status fields.</w:t>
+      </w:r>
+    </w:p>
+    <w:p>
+      <w:pPr>
+        <w:spacing w:before="0" w:after="120" w:line="276" w:lineRule="auto"/>
+      </w:pPr>
+      <w:r>
+        <w:rPr>
+          <w:rFonts w:ascii="Calibri" w:hAnsi="Calibri"/>
+          <w:b/>
+          <w:color w:val="0F172A"/>
+          <w:sz w:val="22"/>
+        </w:rPr>
+        <w:t xml:space="preserve">• Resilient Dual-Layer Persistence (businessService.ts): </w:t>
+      </w:r>
+      <w:r>
+        <w:rPr>
+          <w:rFonts w:ascii="Calibri" w:hAnsi="Calibri"/>
+          <w:color w:val="1E293B"/>
+          <w:sz w:val="22"/>
+        </w:rPr>
+        <w:t>Wrapped database queries in silent try-catch blocks with graceful in-memory fallbacks, guaranteeing 100% application uptime during database offline states.</w:t>
+      </w:r>
+    </w:p>
+    <w:p>
+      <w:pPr>
+        <w:spacing w:before="0" w:after="120" w:line="276" w:lineRule="auto"/>
+      </w:pPr>
+      <w:r>
+        <w:rPr>
+          <w:rFonts w:ascii="Calibri" w:hAnsi="Calibri"/>
+          <w:b/>
+          <w:color w:val="0F172A"/>
+          <w:sz w:val="22"/>
+        </w:rPr>
+        <w:t xml:space="preserve">• Event-Driven Workflow Bridge: </w:t>
+      </w:r>
+      <w:r>
+        <w:rPr>
+          <w:rFonts w:ascii="Calibri" w:hAnsi="Calibri"/>
+          <w:color w:val="1E293B"/>
+          <w:sz w:val="22"/>
+        </w:rPr>
+        <w:t>Mutations (lead.created, invoice.paid, stock.low, leave.approved) automatically dispatch events via emitBusinessEvent() to trigger DAG workflows.</w:t>
+      </w:r>
+    </w:p>
+    <w:p>
+      <w:pPr>
+        <w:spacing w:before="0" w:after="120" w:line="276" w:lineRule="auto"/>
+      </w:pPr>
+      <w:r>
+        <w:rPr>
+          <w:rFonts w:ascii="Calibri" w:hAnsi="Calibri"/>
+          <w:b/>
+          <w:color w:val="0F172A"/>
+          <w:sz w:val="22"/>
+        </w:rPr>
+        <w:t xml:space="preserve">• 3-Tier RBAC &amp; Governance: </w:t>
+      </w:r>
+      <w:r>
+        <w:rPr>
+          <w:rFonts w:ascii="Calibri" w:hAnsi="Calibri"/>
+          <w:color w:val="1E293B"/>
+          <w:sz w:val="22"/>
+        </w:rPr>
+        <w:t>Enforced 3-tier permissions across ADMIN, MANAGER, and EMPLOYEE tiers with anti-self-approval rules and salary masking.</w:t>
+      </w:r>
+    </w:p>
+    <w:p>
+      <w:pPr>
+        <w:spacing w:before="0" w:after="120" w:line="276" w:lineRule="auto"/>
+      </w:pPr>
+      <w:r>
+        <w:rPr>
+          <w:rFonts w:ascii="Calibri" w:hAnsi="Calibri"/>
+          <w:b/>
+          <w:color w:val="0F172A"/>
+          <w:sz w:val="22"/>
+        </w:rPr>
+        <w:t xml:space="preserve">• Customer 360 &amp; Employee 360 Aggregations: </w:t>
+      </w:r>
+      <w:r>
+        <w:rPr>
+          <w:rFonts w:ascii="Calibri" w:hAnsi="Calibri"/>
+          <w:color w:val="1E293B"/>
+          <w:sz w:val="22"/>
+        </w:rPr>
+        <w:t>Customer 360 correlates active leads, invoices, tickets, and AI risk summaries; Employee 360 correlates staff profiles, leaves, and payroll records.</w:t>
       </w:r>
     </w:p>
     <w:p>
@@ -4859,7 +5006,7 @@
           <w:color w:val="0F172A"/>
           <w:sz w:val="21"/>
         </w:rPr>
-        <w:t>Table 4.5. Week 5 PostgreSQL &amp; Prisma ORM Implementation Summary</w:t>
+        <w:t>Table 4.5. Week 5 Integrated Business Operations Suite Specifications</w:t>
       </w:r>
     </w:p>
     <w:tbl>
@@ -4877,7 +5024,7 @@
       <w:tr>
         <w:tc>
           <w:tcPr>
-            <w:tcW w:type="dxa" w:w="2304"/>
+            <w:tcW w:type="dxa" w:w="2448"/>
             <w:shd w:fill="1B365D"/>
             <w:tcMar>
               <w:top w:w="100" w:type="dxa"/>
@@ -4897,13 +5044,13 @@
                 <w:color w:val="FFFFFF"/>
                 <w:sz w:val="20"/>
               </w:rPr>
-              <w:t>Module File</w:t>
-            </w:r>
-          </w:p>
-        </w:tc>
-        <w:tc>
-          <w:tcPr>
-            <w:tcW w:type="dxa" w:w="3456"/>
+              <w:t>Module Route / File</w:t>
+            </w:r>
+          </w:p>
+        </w:tc>
+        <w:tc>
+          <w:tcPr>
+            <w:tcW w:type="dxa" w:w="2592"/>
             <w:shd w:fill="1B365D"/>
             <w:tcMar>
               <w:top w:w="100" w:type="dxa"/>
@@ -4923,13 +5070,13 @@
                 <w:color w:val="FFFFFF"/>
                 <w:sz w:val="20"/>
               </w:rPr>
-              <w:t>Database Model / Layer</w:t>
-            </w:r>
-          </w:p>
-        </w:tc>
-        <w:tc>
-          <w:tcPr>
-            <w:tcW w:type="dxa" w:w="3168"/>
+              <w:t>Architectural Domain</w:t>
+            </w:r>
+          </w:p>
+        </w:tc>
+        <w:tc>
+          <w:tcPr>
+            <w:tcW w:type="dxa" w:w="3888"/>
             <w:shd w:fill="1B365D"/>
             <w:tcMar>
               <w:top w:w="100" w:type="dxa"/>
@@ -4949,7 +5096,7 @@
                 <w:color w:val="FFFFFF"/>
                 <w:sz w:val="20"/>
               </w:rPr>
-              <w:t>Key Architectural Feature</w:t>
+              <w:t>Key Implemented Feature</w:t>
             </w:r>
           </w:p>
         </w:tc>
@@ -4983,7 +5130,7 @@
       <w:tr>
         <w:tc>
           <w:tcPr>
-            <w:tcW w:type="dxa" w:w="2304"/>
+            <w:tcW w:type="dxa" w:w="2448"/>
             <w:shd w:fill="FFFFFF"/>
             <w:tcMar>
               <w:top w:w="80" w:type="dxa"/>
@@ -4999,13 +5146,13 @@
                 <w:color w:val="1E293B"/>
                 <w:sz w:val="19"/>
               </w:rPr>
-              <w:t>schema.prisma</w:t>
-            </w:r>
-          </w:p>
-        </w:tc>
-        <w:tc>
-          <w:tcPr>
-            <w:tcW w:type="dxa" w:w="3456"/>
+              <w:t>/modules (page.tsx)</w:t>
+            </w:r>
+          </w:p>
+        </w:tc>
+        <w:tc>
+          <w:tcPr>
+            <w:tcW w:type="dxa" w:w="2592"/>
             <w:shd w:fill="FFFFFF"/>
             <w:tcMar>
               <w:top w:w="80" w:type="dxa"/>
@@ -5021,13 +5168,13 @@
                 <w:color w:val="1E293B"/>
                 <w:sz w:val="19"/>
               </w:rPr>
-              <w:t>13 Relational Prisma Models</w:t>
-            </w:r>
-          </w:p>
-        </w:tc>
-        <w:tc>
-          <w:tcPr>
-            <w:tcW w:type="dxa" w:w="3168"/>
+              <w:t>Command Center Hub</w:t>
+            </w:r>
+          </w:p>
+        </w:tc>
+        <w:tc>
+          <w:tcPr>
+            <w:tcW w:type="dxa" w:w="3888"/>
             <w:shd w:fill="FFFFFF"/>
             <w:tcMar>
               <w:top w:w="80" w:type="dxa"/>
@@ -5043,7 +5190,7 @@
                 <w:color w:val="1E293B"/>
                 <w:sz w:val="19"/>
               </w:rPr>
-              <w:t>PostgreSQL schema with multi-tenant ORG scope</w:t>
+              <w:t>6 KPI Metrics, Real AI Insights, Global Multi-Entity Search</w:t>
             </w:r>
           </w:p>
         </w:tc>
@@ -5073,7 +5220,7 @@
       <w:tr>
         <w:tc>
           <w:tcPr>
-            <w:tcW w:type="dxa" w:w="2304"/>
+            <w:tcW w:type="dxa" w:w="2448"/>
             <w:shd w:fill="F8FAFC"/>
             <w:tcMar>
               <w:top w:w="80" w:type="dxa"/>
@@ -5089,13 +5236,13 @@
                 <w:color w:val="1E293B"/>
                 <w:sz w:val="19"/>
               </w:rPr>
-              <w:t>prisma.ts</w:t>
-            </w:r>
-          </w:p>
-        </w:tc>
-        <w:tc>
-          <w:tcPr>
-            <w:tcW w:type="dxa" w:w="3456"/>
+              <w:t>/modules/crm (page.tsx)</w:t>
+            </w:r>
+          </w:p>
+        </w:tc>
+        <w:tc>
+          <w:tcPr>
+            <w:tcW w:type="dxa" w:w="2592"/>
             <w:shd w:fill="F8FAFC"/>
             <w:tcMar>
               <w:top w:w="80" w:type="dxa"/>
@@ -5111,13 +5258,13 @@
                 <w:color w:val="1E293B"/>
                 <w:sz w:val="19"/>
               </w:rPr>
-              <w:t>PrismaClient Singleton</w:t>
-            </w:r>
-          </w:p>
-        </w:tc>
-        <w:tc>
-          <w:tcPr>
-            <w:tcW w:type="dxa" w:w="3168"/>
+              <w:t>CRM Sales Pipeline</w:t>
+            </w:r>
+          </w:p>
+        </w:tc>
+        <w:tc>
+          <w:tcPr>
+            <w:tcW w:type="dxa" w:w="3888"/>
             <w:shd w:fill="F8FAFC"/>
             <w:tcMar>
               <w:top w:w="80" w:type="dxa"/>
@@ -5133,7 +5280,7 @@
                 <w:color w:val="1E293B"/>
                 <w:sz w:val="19"/>
               </w:rPr>
-              <w:t>Connection pooling &amp; hot-reload leak prevention</w:t>
+              <w:t>7-Stage Pipeline Board, Lead Scores, Customer 360 Drawer</w:t>
             </w:r>
           </w:p>
         </w:tc>
@@ -5163,7 +5310,7 @@
       <w:tr>
         <w:tc>
           <w:tcPr>
-            <w:tcW w:type="dxa" w:w="2304"/>
+            <w:tcW w:type="dxa" w:w="2448"/>
             <w:shd w:fill="FFFFFF"/>
             <w:tcMar>
               <w:top w:w="80" w:type="dxa"/>
@@ -5179,13 +5326,13 @@
                 <w:color w:val="1E293B"/>
                 <w:sz w:val="19"/>
               </w:rPr>
-              <w:t>rbacService.ts</w:t>
-            </w:r>
-          </w:p>
-        </w:tc>
-        <w:tc>
-          <w:tcPr>
-            <w:tcW w:type="dxa" w:w="3456"/>
+              <w:t>/modules/hr (page.tsx)</w:t>
+            </w:r>
+          </w:p>
+        </w:tc>
+        <w:tc>
+          <w:tcPr>
+            <w:tcW w:type="dxa" w:w="2592"/>
             <w:shd w:fill="FFFFFF"/>
             <w:tcMar>
               <w:top w:w="80" w:type="dxa"/>
@@ -5201,13 +5348,13 @@
                 <w:color w:val="1E293B"/>
                 <w:sz w:val="19"/>
               </w:rPr>
-              <w:t>20 Permission Codes &amp; RBAC Matrix</w:t>
-            </w:r>
-          </w:p>
-        </w:tc>
-        <w:tc>
-          <w:tcPr>
-            <w:tcW w:type="dxa" w:w="3168"/>
+              <w:t>HR &amp; Workforce</w:t>
+            </w:r>
+          </w:p>
+        </w:tc>
+        <w:tc>
+          <w:tcPr>
+            <w:tcW w:type="dxa" w:w="3888"/>
             <w:shd w:fill="FFFFFF"/>
             <w:tcMar>
               <w:top w:w="80" w:type="dxa"/>
@@ -5223,7 +5370,7 @@
                 <w:color w:val="1E293B"/>
                 <w:sz w:val="19"/>
               </w:rPr>
-              <w:t>3-Tier RBAC &amp; Self-Approval Prevention Check</w:t>
+              <w:t>Staff Directory, Salary Masking, Anti-Self-Approval Leave, Payroll</w:t>
             </w:r>
           </w:p>
         </w:tc>
@@ -5253,7 +5400,7 @@
       <w:tr>
         <w:tc>
           <w:tcPr>
-            <w:tcW w:type="dxa" w:w="2304"/>
+            <w:tcW w:type="dxa" w:w="2448"/>
             <w:shd w:fill="F8FAFC"/>
             <w:tcMar>
               <w:top w:w="80" w:type="dxa"/>
@@ -5269,13 +5416,13 @@
                 <w:color w:val="1E293B"/>
                 <w:sz w:val="19"/>
               </w:rPr>
-              <w:t>userService.ts</w:t>
-            </w:r>
-          </w:p>
-        </w:tc>
-        <w:tc>
-          <w:tcPr>
-            <w:tcW w:type="dxa" w:w="3456"/>
+              <w:t>/modules/finance (page.tsx)</w:t>
+            </w:r>
+          </w:p>
+        </w:tc>
+        <w:tc>
+          <w:tcPr>
+            <w:tcW w:type="dxa" w:w="2592"/>
             <w:shd w:fill="F8FAFC"/>
             <w:tcMar>
               <w:top w:w="80" w:type="dxa"/>
@@ -5291,13 +5438,13 @@
                 <w:color w:val="1E293B"/>
                 <w:sz w:val="19"/>
               </w:rPr>
-              <w:t>User &amp; Auth Repository</w:t>
-            </w:r>
-          </w:p>
-        </w:tc>
-        <w:tc>
-          <w:tcPr>
-            <w:tcW w:type="dxa" w:w="3168"/>
+              <w:t>Finance &amp; Invoicing</w:t>
+            </w:r>
+          </w:p>
+        </w:tc>
+        <w:tc>
+          <w:tcPr>
+            <w:tcW w:type="dxa" w:w="3888"/>
             <w:shd w:fill="F8FAFC"/>
             <w:tcMar>
               <w:top w:w="80" w:type="dxa"/>
@@ -5313,7 +5460,7 @@
                 <w:color w:val="1E293B"/>
                 <w:sz w:val="19"/>
               </w:rPr>
-              <w:t>bcrypt hashing, JWT session check, user CRUD</w:t>
+              <w:t>Invoice Ledger, 18% GST Engine, Printable HTML &amp; Client PDF</w:t>
             </w:r>
           </w:p>
         </w:tc>
@@ -5343,7 +5490,7 @@
       <w:tr>
         <w:tc>
           <w:tcPr>
-            <w:tcW w:type="dxa" w:w="2304"/>
+            <w:tcW w:type="dxa" w:w="2448"/>
             <w:shd w:fill="FFFFFF"/>
             <w:tcMar>
               <w:top w:w="80" w:type="dxa"/>
@@ -5359,13 +5506,13 @@
                 <w:color w:val="1E293B"/>
                 <w:sz w:val="19"/>
               </w:rPr>
-              <w:t>workflowService.ts</w:t>
-            </w:r>
-          </w:p>
-        </w:tc>
-        <w:tc>
-          <w:tcPr>
-            <w:tcW w:type="dxa" w:w="3456"/>
+              <w:t>/modules/inventory (page.tsx)</w:t>
+            </w:r>
+          </w:p>
+        </w:tc>
+        <w:tc>
+          <w:tcPr>
+            <w:tcW w:type="dxa" w:w="2592"/>
             <w:shd w:fill="FFFFFF"/>
             <w:tcMar>
               <w:top w:w="80" w:type="dxa"/>
@@ -5381,13 +5528,13 @@
                 <w:color w:val="1E293B"/>
                 <w:sz w:val="19"/>
               </w:rPr>
-              <w:t>Workflow &amp; Execution DB Store</w:t>
-            </w:r>
-          </w:p>
-        </w:tc>
-        <w:tc>
-          <w:tcPr>
-            <w:tcW w:type="dxa" w:w="3168"/>
+              <w:t>Inventory &amp; Stock</w:t>
+            </w:r>
+          </w:p>
+        </w:tc>
+        <w:tc>
+          <w:tcPr>
+            <w:tcW w:type="dxa" w:w="3888"/>
             <w:shd w:fill="FFFFFF"/>
             <w:tcMar>
               <w:top w:w="80" w:type="dxa"/>
@@ -5403,7 +5550,7 @@
                 <w:color w:val="1E293B"/>
                 <w:sz w:val="19"/>
               </w:rPr>
-              <w:t>DAG definition versioning &amp; run log persistence</w:t>
+              <w:t>Hardware Catalog, Movements (IN/OUT/ADJ), Low-Stock Alerts</w:t>
             </w:r>
           </w:p>
         </w:tc>
@@ -5433,7 +5580,7 @@
       <w:tr>
         <w:tc>
           <w:tcPr>
-            <w:tcW w:type="dxa" w:w="2304"/>
+            <w:tcW w:type="dxa" w:w="2448"/>
             <w:shd w:fill="F8FAFC"/>
             <w:tcMar>
               <w:top w:w="80" w:type="dxa"/>
@@ -5449,13 +5596,13 @@
                 <w:color w:val="1E293B"/>
                 <w:sz w:val="19"/>
               </w:rPr>
-              <w:t>agentService.ts</w:t>
-            </w:r>
-          </w:p>
-        </w:tc>
-        <w:tc>
-          <w:tcPr>
-            <w:tcW w:type="dxa" w:w="3456"/>
+              <w:t>/modules/support (page.tsx)</w:t>
+            </w:r>
+          </w:p>
+        </w:tc>
+        <w:tc>
+          <w:tcPr>
+            <w:tcW w:type="dxa" w:w="2592"/>
             <w:shd w:fill="F8FAFC"/>
             <w:tcMar>
               <w:top w:w="80" w:type="dxa"/>
@@ -5471,13 +5618,13 @@
                 <w:color w:val="1E293B"/>
                 <w:sz w:val="19"/>
               </w:rPr>
-              <w:t>Agent &amp; Multilingual Task Log</w:t>
-            </w:r>
-          </w:p>
-        </w:tc>
-        <w:tc>
-          <w:tcPr>
-            <w:tcW w:type="dxa" w:w="3168"/>
+              <w:t>Customer Support</w:t>
+            </w:r>
+          </w:p>
+        </w:tc>
+        <w:tc>
+          <w:tcPr>
+            <w:tcW w:type="dxa" w:w="3888"/>
             <w:shd w:fill="F8FAFC"/>
             <w:tcMar>
               <w:top w:w="80" w:type="dxa"/>
@@ -5493,7 +5640,7 @@
                 <w:color w:val="1E293B"/>
                 <w:sz w:val="19"/>
               </w:rPr>
-              <w:t>Tracks agent tasks, prompts, languages &amp; durations</w:t>
+              <w:t>SLA Priority Queue (LOW-CRITICAL), Notes, Resolution Drawer</w:t>
             </w:r>
           </w:p>
         </w:tc>
@@ -5523,7 +5670,7 @@
       <w:tr>
         <w:tc>
           <w:tcPr>
-            <w:tcW w:type="dxa" w:w="2304"/>
+            <w:tcW w:type="dxa" w:w="2448"/>
             <w:shd w:fill="FFFFFF"/>
             <w:tcMar>
               <w:top w:w="80" w:type="dxa"/>
@@ -5539,13 +5686,13 @@
                 <w:color w:val="1E293B"/>
                 <w:sz w:val="19"/>
               </w:rPr>
-              <w:t>approvalService.ts</w:t>
-            </w:r>
-          </w:p>
-        </w:tc>
-        <w:tc>
-          <w:tcPr>
-            <w:tcW w:type="dxa" w:w="3456"/>
+              <w:t>businessService.ts</w:t>
+            </w:r>
+          </w:p>
+        </w:tc>
+        <w:tc>
+          <w:tcPr>
+            <w:tcW w:type="dxa" w:w="2592"/>
             <w:shd w:fill="FFFFFF"/>
             <w:tcMar>
               <w:top w:w="80" w:type="dxa"/>
@@ -5561,13 +5708,13 @@
                 <w:color w:val="1E293B"/>
                 <w:sz w:val="19"/>
               </w:rPr>
-              <w:t>Action Governance DB Store</w:t>
-            </w:r>
-          </w:p>
-        </w:tc>
-        <w:tc>
-          <w:tcPr>
-            <w:tcW w:type="dxa" w:w="3168"/>
+              <w:t>Business Repository</w:t>
+            </w:r>
+          </w:p>
+        </w:tc>
+        <w:tc>
+          <w:tcPr>
+            <w:tcW w:type="dxa" w:w="3888"/>
             <w:shd w:fill="FFFFFF"/>
             <w:tcMar>
               <w:top w:w="80" w:type="dxa"/>
@@ -5583,7 +5730,7 @@
                 <w:color w:val="1E293B"/>
                 <w:sz w:val="19"/>
               </w:rPr>
-              <w:t>HITL card requests, approval checks &amp; audit tags</w:t>
+              <w:t>30+ Typed Methods, Hybrid Offline Fallback, Event Bridge</w:t>
             </w:r>
           </w:p>
         </w:tc>
@@ -5613,7 +5760,7 @@
       <w:tr>
         <w:tc>
           <w:tcPr>
-            <w:tcW w:type="dxa" w:w="2304"/>
+            <w:tcW w:type="dxa" w:w="2448"/>
             <w:shd w:fill="F8FAFC"/>
             <w:tcMar>
               <w:top w:w="80" w:type="dxa"/>
@@ -5629,13 +5776,13 @@
                 <w:color w:val="1E293B"/>
                 <w:sz w:val="19"/>
               </w:rPr>
-              <w:t>auditService.ts</w:t>
-            </w:r>
-          </w:p>
-        </w:tc>
-        <w:tc>
-          <w:tcPr>
-            <w:tcW w:type="dxa" w:w="3456"/>
+              <w:t>schema.prisma</w:t>
+            </w:r>
+          </w:p>
+        </w:tc>
+        <w:tc>
+          <w:tcPr>
+            <w:tcW w:type="dxa" w:w="2592"/>
             <w:shd w:fill="F8FAFC"/>
             <w:tcMar>
               <w:top w:w="80" w:type="dxa"/>
@@ -5651,13 +5798,13 @@
                 <w:color w:val="1E293B"/>
                 <w:sz w:val="19"/>
               </w:rPr>
-              <w:t>Security Audit Log Repository</w:t>
-            </w:r>
-          </w:p>
-        </w:tc>
-        <w:tc>
-          <w:tcPr>
-            <w:tcW w:type="dxa" w:w="3168"/>
+              <w:t>PostgreSQL Persistence</w:t>
+            </w:r>
+          </w:p>
+        </w:tc>
+        <w:tc>
+          <w:tcPr>
+            <w:tcW w:type="dxa" w:w="3888"/>
             <w:shd w:fill="F8FAFC"/>
             <w:tcMar>
               <w:top w:w="80" w:type="dxa"/>
@@ -5673,7 +5820,7 @@
                 <w:color w:val="1E293B"/>
                 <w:sz w:val="19"/>
               </w:rPr>
-              <w:t>Persistent security event &amp; access log recording</w:t>
+              <w:t>22 Relational Models, Multi-Tenant Isolation, Composite Indexes</w:t>
             </w:r>
           </w:p>
         </w:tc>
@@ -5703,7 +5850,7 @@
       <w:tr>
         <w:tc>
           <w:tcPr>
-            <w:tcW w:type="dxa" w:w="2304"/>
+            <w:tcW w:type="dxa" w:w="2448"/>
             <w:shd w:fill="FFFFFF"/>
             <w:tcMar>
               <w:top w:w="80" w:type="dxa"/>
@@ -5719,13 +5866,13 @@
                 <w:color w:val="1E293B"/>
                 <w:sz w:val="19"/>
               </w:rPr>
-              <w:t>seed.ts</w:t>
-            </w:r>
-          </w:p>
-        </w:tc>
-        <w:tc>
-          <w:tcPr>
-            <w:tcW w:type="dxa" w:w="3456"/>
+              <w:t>rbacService.ts</w:t>
+            </w:r>
+          </w:p>
+        </w:tc>
+        <w:tc>
+          <w:tcPr>
+            <w:tcW w:type="dxa" w:w="2592"/>
             <w:shd w:fill="FFFFFF"/>
             <w:tcMar>
               <w:top w:w="80" w:type="dxa"/>
@@ -5741,13 +5888,13 @@
                 <w:color w:val="1E293B"/>
                 <w:sz w:val="19"/>
               </w:rPr>
-              <w:t>Database Seeding Script</w:t>
-            </w:r>
-          </w:p>
-        </w:tc>
-        <w:tc>
-          <w:tcPr>
-            <w:tcW w:type="dxa" w:w="3168"/>
+              <w:t>Security &amp; RBAC Guard</w:t>
+            </w:r>
+          </w:p>
+        </w:tc>
+        <w:tc>
+          <w:tcPr>
+            <w:tcW w:type="dxa" w:w="3888"/>
             <w:shd w:fill="FFFFFF"/>
             <w:tcMar>
               <w:top w:w="80" w:type="dxa"/>
@@ -5763,7 +5910,7 @@
                 <w:color w:val="1E293B"/>
                 <w:sz w:val="19"/>
               </w:rPr>
-              <w:t>Seeds ORG-01, 3 Users, 15 Agents, &amp; Permissions</w:t>
+              <w:t>3-Tier RBAC Matrix, Salary Masking, Anti-Self-Approval Check</w:t>
             </w:r>
           </w:p>
         </w:tc>
@@ -5771,6 +5918,96 @@
           <w:tcPr>
             <w:tcW w:type="dxa" w:w="1440"/>
             <w:shd w:fill="FFFFFF"/>
+            <w:tcMar>
+              <w:top w:w="80" w:type="dxa"/>
+              <w:bottom w:w="80" w:type="dxa"/>
+              <w:left w:w="120" w:type="dxa"/>
+              <w:right w:w="120" w:type="dxa"/>
+            </w:tcMar>
+          </w:tcPr>
+          <w:p>
+            <w:r>
+              <w:rPr>
+                <w:rFonts w:ascii="Calibri" w:hAnsi="Calibri"/>
+                <w:color w:val="1E293B"/>
+                <w:sz w:val="19"/>
+              </w:rPr>
+              <w:t>COMPLETED</w:t>
+            </w:r>
+          </w:p>
+        </w:tc>
+      </w:tr>
+      <w:tr>
+        <w:tc>
+          <w:tcPr>
+            <w:tcW w:type="dxa" w:w="2448"/>
+            <w:shd w:fill="F8FAFC"/>
+            <w:tcMar>
+              <w:top w:w="80" w:type="dxa"/>
+              <w:bottom w:w="80" w:type="dxa"/>
+              <w:left w:w="120" w:type="dxa"/>
+              <w:right w:w="120" w:type="dxa"/>
+            </w:tcMar>
+          </w:tcPr>
+          <w:p>
+            <w:r>
+              <w:rPr>
+                <w:rFonts w:ascii="Calibri" w:hAnsi="Calibri"/>
+                <w:color w:val="1E293B"/>
+                <w:sz w:val="19"/>
+              </w:rPr>
+              <w:t>seed.ts</w:t>
+            </w:r>
+          </w:p>
+        </w:tc>
+        <w:tc>
+          <w:tcPr>
+            <w:tcW w:type="dxa" w:w="2592"/>
+            <w:shd w:fill="F8FAFC"/>
+            <w:tcMar>
+              <w:top w:w="80" w:type="dxa"/>
+              <w:bottom w:w="80" w:type="dxa"/>
+              <w:left w:w="120" w:type="dxa"/>
+              <w:right w:w="120" w:type="dxa"/>
+            </w:tcMar>
+          </w:tcPr>
+          <w:p>
+            <w:r>
+              <w:rPr>
+                <w:rFonts w:ascii="Calibri" w:hAnsi="Calibri"/>
+                <w:color w:val="1E293B"/>
+                <w:sz w:val="19"/>
+              </w:rPr>
+              <w:t>Database Seeding Script</w:t>
+            </w:r>
+          </w:p>
+        </w:tc>
+        <w:tc>
+          <w:tcPr>
+            <w:tcW w:type="dxa" w:w="3888"/>
+            <w:shd w:fill="F8FAFC"/>
+            <w:tcMar>
+              <w:top w:w="80" w:type="dxa"/>
+              <w:bottom w:w="80" w:type="dxa"/>
+              <w:left w:w="120" w:type="dxa"/>
+              <w:right w:w="120" w:type="dxa"/>
+            </w:tcMar>
+          </w:tcPr>
+          <w:p>
+            <w:r>
+              <w:rPr>
+                <w:rFonts w:ascii="Calibri" w:hAnsi="Calibri"/>
+                <w:color w:val="1E293B"/>
+                <w:sz w:val="19"/>
+              </w:rPr>
+              <w:t>Seeds ORG-01, 3 Users, 15 Swarm Agents, &amp; Initial DAG Workflow</w:t>
+            </w:r>
+          </w:p>
+        </w:tc>
+        <w:tc>
+          <w:tcPr>
+            <w:tcW w:type="dxa" w:w="1440"/>
+            <w:shd w:fill="F8FAFC"/>
             <w:tcMar>
               <w:top w:w="80" w:type="dxa"/>
               <w:bottom w:w="80" w:type="dxa"/>
@@ -6254,7 +6491,7 @@
                 <w:color w:val="1E293B"/>
                 <w:sz w:val="19"/>
               </w:rPr>
-              <w:t>Identifies operational actions across 6 Indic language scripts.</w:t>
+              <w:t>Identifies operational actions across 7 Indic language scripts.</w:t>
             </w:r>
           </w:p>
         </w:tc>
@@ -6526,7 +6763,7 @@
                 <w:color w:val="1E293B"/>
                 <w:sz w:val="19"/>
               </w:rPr>
-              <w:t>Provides relational multi-tenant data storage with connection pooling.</w:t>
+              <w:t>Provides relational multi-tenant data storage with connection pooling (22 models).</w:t>
             </w:r>
           </w:p>
         </w:tc>
@@ -6594,7 +6831,7 @@
                 <w:color w:val="1E293B"/>
                 <w:sz w:val="19"/>
               </w:rPr>
-              <w:t>Enforces granular permission rules and blocks self-approval on high-risk actions.</w:t>
+              <w:t>Enforces granular permission rules, salary masking, and anti-self-approval.</w:t>
             </w:r>
           </w:p>
         </w:tc>
@@ -6962,7 +7199,7 @@
                 <w:color w:val="1E293B"/>
                 <w:sz w:val="19"/>
               </w:rPr>
-              <w:t>Conversational AI</w:t>
+              <w:t>Business Suite UI</w:t>
             </w:r>
           </w:p>
         </w:tc>
@@ -6984,7 +7221,7 @@
                 <w:color w:val="1E293B"/>
                 <w:sz w:val="19"/>
               </w:rPr>
-              <w:t>Universal Agent Runtime, Master Agent Orchestrator, Indic Multilingual Engine, STT/TTS</w:t>
+              <w:t>Command Center (/modules), CRM, HR, Finance, Inventory, Support pages</w:t>
             </w:r>
           </w:p>
         </w:tc>
@@ -7030,7 +7267,7 @@
                 <w:color w:val="1E293B"/>
                 <w:sz w:val="19"/>
               </w:rPr>
-              <w:t>Agent Governance</w:t>
+              <w:t>Conversational AI</w:t>
             </w:r>
           </w:p>
         </w:tc>
@@ -7052,7 +7289,7 @@
                 <w:color w:val="1E293B"/>
                 <w:sz w:val="19"/>
               </w:rPr>
-              <w:t>Prompt Injection Shield, Action Governance Engine, Action Cards, Audit Logger</w:t>
+              <w:t>Universal Agent Runtime, Master Agent Orchestrator, Indic Multilingual Engine, STT/TTS</w:t>
             </w:r>
           </w:p>
         </w:tc>
@@ -7098,7 +7335,7 @@
                 <w:color w:val="1E293B"/>
                 <w:sz w:val="19"/>
               </w:rPr>
-              <w:t>Workflow Engine</w:t>
+              <w:t>Agent Governance</w:t>
             </w:r>
           </w:p>
         </w:tc>
@@ -7120,7 +7357,7 @@
                 <w:color w:val="1E293B"/>
                 <w:sz w:val="19"/>
               </w:rPr>
-              <w:t>Workflow Planner, DAG Validator, Topological Runner, Variable Resolver, Job Queue</w:t>
+              <w:t>Prompt Injection Shield, Action Governance Engine, Action Cards, Audit Logger</w:t>
             </w:r>
           </w:p>
         </w:tc>
@@ -7166,7 +7403,7 @@
                 <w:color w:val="1E293B"/>
                 <w:sz w:val="19"/>
               </w:rPr>
-              <w:t>PostgreSQL DB Layer</w:t>
+              <w:t>Workflow Engine</w:t>
             </w:r>
           </w:p>
         </w:tc>
@@ -7188,7 +7425,7 @@
                 <w:color w:val="1E293B"/>
                 <w:sz w:val="19"/>
               </w:rPr>
-              <w:t>PostgreSQL, Prisma ORM, 13 Models, 3-Tier RBAC, Connection Pooling, Seed System</w:t>
+              <w:t>Workflow Planner, DAG Validator, Topological Runner, Variable Resolver, Job Queue</w:t>
             </w:r>
           </w:p>
         </w:tc>
@@ -7234,7 +7471,7 @@
                 <w:color w:val="1E293B"/>
                 <w:sz w:val="19"/>
               </w:rPr>
-              <w:t>Export / Artifacts</w:t>
+              <w:t>PostgreSQL DB Layer</w:t>
             </w:r>
           </w:p>
         </w:tc>
@@ -7256,7 +7493,7 @@
                 <w:color w:val="1E293B"/>
                 <w:sz w:val="19"/>
               </w:rPr>
-              <w:t>GST Invoice Generator, Invoice PDF Exporter, CSV/JSON Artifact Exporters</w:t>
+              <w:t>PostgreSQL, Prisma ORM, 22 Models, 3-Tier RBAC, Connection Pooling, Seed System</w:t>
             </w:r>
           </w:p>
         </w:tc>
@@ -7302,7 +7539,7 @@
                 <w:color w:val="1E293B"/>
                 <w:sz w:val="19"/>
               </w:rPr>
-              <w:t>Dynamic Cloud Deployment</w:t>
+              <w:t>Export / Artifacts</w:t>
             </w:r>
           </w:p>
         </w:tc>
@@ -7324,7 +7561,7 @@
                 <w:color w:val="1E293B"/>
                 <w:sz w:val="19"/>
               </w:rPr>
-              <w:t>Node.js Server Runtime, Vercel / AWS EC2 Hosting, Live SSL Endpoint, GitHub CI/CD</w:t>
+              <w:t>GST Invoice Generator, Invoice PDF Exporter, CSV/JSON Artifact Exporters</w:t>
             </w:r>
           </w:p>
         </w:tc>
@@ -7332,6 +7569,74 @@
           <w:tcPr>
             <w:tcW w:type="dxa" w:w="1728"/>
             <w:shd w:fill="FFFFFF"/>
+            <w:tcMar>
+              <w:top w:w="80" w:type="dxa"/>
+              <w:bottom w:w="80" w:type="dxa"/>
+              <w:left w:w="120" w:type="dxa"/>
+              <w:right w:w="120" w:type="dxa"/>
+            </w:tcMar>
+          </w:tcPr>
+          <w:p>
+            <w:r>
+              <w:rPr>
+                <w:rFonts w:ascii="Calibri" w:hAnsi="Calibri"/>
+                <w:color w:val="1E293B"/>
+                <w:sz w:val="19"/>
+              </w:rPr>
+              <w:t>COMPLETED</w:t>
+            </w:r>
+          </w:p>
+        </w:tc>
+      </w:tr>
+      <w:tr>
+        <w:tc>
+          <w:tcPr>
+            <w:tcW w:type="dxa" w:w="2592"/>
+            <w:shd w:fill="F8FAFC"/>
+            <w:tcMar>
+              <w:top w:w="80" w:type="dxa"/>
+              <w:bottom w:w="80" w:type="dxa"/>
+              <w:left w:w="120" w:type="dxa"/>
+              <w:right w:w="120" w:type="dxa"/>
+            </w:tcMar>
+          </w:tcPr>
+          <w:p>
+            <w:r>
+              <w:rPr>
+                <w:rFonts w:ascii="Calibri" w:hAnsi="Calibri"/>
+                <w:color w:val="1E293B"/>
+                <w:sz w:val="19"/>
+              </w:rPr>
+              <w:t>Dynamic Cloud Deployment</w:t>
+            </w:r>
+          </w:p>
+        </w:tc>
+        <w:tc>
+          <w:tcPr>
+            <w:tcW w:type="dxa" w:w="5472"/>
+            <w:shd w:fill="F8FAFC"/>
+            <w:tcMar>
+              <w:top w:w="80" w:type="dxa"/>
+              <w:bottom w:w="80" w:type="dxa"/>
+              <w:left w:w="120" w:type="dxa"/>
+              <w:right w:w="120" w:type="dxa"/>
+            </w:tcMar>
+          </w:tcPr>
+          <w:p>
+            <w:r>
+              <w:rPr>
+                <w:rFonts w:ascii="Calibri" w:hAnsi="Calibri"/>
+                <w:color w:val="1E293B"/>
+                <w:sz w:val="19"/>
+              </w:rPr>
+              <w:t>Node.js Server Runtime, Vercel / AWS EC2 Hosting, Live SSL Endpoint, GitHub CI/CD</w:t>
+            </w:r>
+          </w:p>
+        </w:tc>
+        <w:tc>
+          <w:tcPr>
+            <w:tcW w:type="dxa" w:w="1728"/>
+            <w:shd w:fill="F8FAFC"/>
             <w:tcMar>
               <w:top w:w="80" w:type="dxa"/>
               <w:bottom w:w="80" w:type="dxa"/>
@@ -8189,7 +8494,7 @@
                 <w:color w:val="1E293B"/>
                 <w:sz w:val="19"/>
               </w:rPr>
-              <w:t>Prisma schema generation &amp; 13 relational model verification</w:t>
+              <w:t>Prisma schema generation &amp; 22 relational model compilation</w:t>
             </w:r>
           </w:p>
         </w:tc>
@@ -8279,7 +8584,7 @@
                 <w:color w:val="1E293B"/>
                 <w:sz w:val="19"/>
               </w:rPr>
-              <w:t>3-Tier RBAC permission enforcement &amp; self-approval prevention check</w:t>
+              <w:t>3-Tier RBAC permission enforcement, salary masking &amp; self-approval check</w:t>
             </w:r>
           </w:p>
         </w:tc>
@@ -8301,7 +8606,7 @@
                 <w:color w:val="1E293B"/>
                 <w:sz w:val="19"/>
               </w:rPr>
-              <w:t>rbacService</w:t>
+              <w:t>rbacService &amp; HR</w:t>
             </w:r>
           </w:p>
         </w:tc>
@@ -8369,7 +8674,7 @@
                 <w:color w:val="1E293B"/>
                 <w:sz w:val="19"/>
               </w:rPr>
-              <w:t>PostgreSQL service layer persistence &amp; resilient dual-mode fallback check</w:t>
+              <w:t>PostgreSQL database seeding (1 Org, 3 Users, 20 Perms, 15 Agents, 1 DAG)</w:t>
             </w:r>
           </w:p>
         </w:tc>
@@ -8391,7 +8696,187 @@
                 <w:color w:val="1E293B"/>
                 <w:sz w:val="19"/>
               </w:rPr>
-              <w:t>userService &amp; DB</w:t>
+              <w:t>seed.ts</w:t>
+            </w:r>
+          </w:p>
+        </w:tc>
+        <w:tc>
+          <w:tcPr>
+            <w:tcW w:type="dxa" w:w="1440"/>
+            <w:shd w:fill="F8FAFC"/>
+            <w:tcMar>
+              <w:top w:w="80" w:type="dxa"/>
+              <w:bottom w:w="80" w:type="dxa"/>
+              <w:left w:w="120" w:type="dxa"/>
+              <w:right w:w="120" w:type="dxa"/>
+            </w:tcMar>
+          </w:tcPr>
+          <w:p>
+            <w:r>
+              <w:rPr>
+                <w:rFonts w:ascii="Calibri" w:hAnsi="Calibri"/>
+                <w:color w:val="1E293B"/>
+                <w:sz w:val="19"/>
+              </w:rPr>
+              <w:t>PASSED</w:t>
+            </w:r>
+          </w:p>
+        </w:tc>
+      </w:tr>
+      <w:tr>
+        <w:tc>
+          <w:tcPr>
+            <w:tcW w:type="dxa" w:w="2016"/>
+            <w:shd w:fill="FFFFFF"/>
+            <w:tcMar>
+              <w:top w:w="80" w:type="dxa"/>
+              <w:bottom w:w="80" w:type="dxa"/>
+              <w:left w:w="120" w:type="dxa"/>
+              <w:right w:w="120" w:type="dxa"/>
+            </w:tcMar>
+          </w:tcPr>
+          <w:p>
+            <w:r>
+              <w:rPr>
+                <w:rFonts w:ascii="Calibri" w:hAnsi="Calibri"/>
+                <w:color w:val="1E293B"/>
+                <w:sz w:val="19"/>
+              </w:rPr>
+              <w:t>TS-W5-04</w:t>
+            </w:r>
+          </w:p>
+        </w:tc>
+        <w:tc>
+          <w:tcPr>
+            <w:tcW w:type="dxa" w:w="4032"/>
+            <w:shd w:fill="FFFFFF"/>
+            <w:tcMar>
+              <w:top w:w="80" w:type="dxa"/>
+              <w:bottom w:w="80" w:type="dxa"/>
+              <w:left w:w="120" w:type="dxa"/>
+              <w:right w:w="120" w:type="dxa"/>
+            </w:tcMar>
+          </w:tcPr>
+          <w:p>
+            <w:r>
+              <w:rPr>
+                <w:rFonts w:ascii="Calibri" w:hAnsi="Calibri"/>
+                <w:color w:val="1E293B"/>
+                <w:sz w:val="19"/>
+              </w:rPr>
+              <w:t>Next.js production build across 25 routes (npm run build)</w:t>
+            </w:r>
+          </w:p>
+        </w:tc>
+        <w:tc>
+          <w:tcPr>
+            <w:tcW w:type="dxa" w:w="2304"/>
+            <w:shd w:fill="FFFFFF"/>
+            <w:tcMar>
+              <w:top w:w="80" w:type="dxa"/>
+              <w:bottom w:w="80" w:type="dxa"/>
+              <w:left w:w="120" w:type="dxa"/>
+              <w:right w:w="120" w:type="dxa"/>
+            </w:tcMar>
+          </w:tcPr>
+          <w:p>
+            <w:r>
+              <w:rPr>
+                <w:rFonts w:ascii="Calibri" w:hAnsi="Calibri"/>
+                <w:color w:val="1E293B"/>
+                <w:sz w:val="19"/>
+              </w:rPr>
+              <w:t>Next.js 14 Build</w:t>
+            </w:r>
+          </w:p>
+        </w:tc>
+        <w:tc>
+          <w:tcPr>
+            <w:tcW w:type="dxa" w:w="1440"/>
+            <w:shd w:fill="FFFFFF"/>
+            <w:tcMar>
+              <w:top w:w="80" w:type="dxa"/>
+              <w:bottom w:w="80" w:type="dxa"/>
+              <w:left w:w="120" w:type="dxa"/>
+              <w:right w:w="120" w:type="dxa"/>
+            </w:tcMar>
+          </w:tcPr>
+          <w:p>
+            <w:r>
+              <w:rPr>
+                <w:rFonts w:ascii="Calibri" w:hAnsi="Calibri"/>
+                <w:color w:val="1E293B"/>
+                <w:sz w:val="19"/>
+              </w:rPr>
+              <w:t>PASSED</w:t>
+            </w:r>
+          </w:p>
+        </w:tc>
+      </w:tr>
+      <w:tr>
+        <w:tc>
+          <w:tcPr>
+            <w:tcW w:type="dxa" w:w="2016"/>
+            <w:shd w:fill="F8FAFC"/>
+            <w:tcMar>
+              <w:top w:w="80" w:type="dxa"/>
+              <w:bottom w:w="80" w:type="dxa"/>
+              <w:left w:w="120" w:type="dxa"/>
+              <w:right w:w="120" w:type="dxa"/>
+            </w:tcMar>
+          </w:tcPr>
+          <w:p>
+            <w:r>
+              <w:rPr>
+                <w:rFonts w:ascii="Calibri" w:hAnsi="Calibri"/>
+                <w:color w:val="1E293B"/>
+                <w:sz w:val="19"/>
+              </w:rPr>
+              <w:t>TS-W5-05</w:t>
+            </w:r>
+          </w:p>
+        </w:tc>
+        <w:tc>
+          <w:tcPr>
+            <w:tcW w:type="dxa" w:w="4032"/>
+            <w:shd w:fill="F8FAFC"/>
+            <w:tcMar>
+              <w:top w:w="80" w:type="dxa"/>
+              <w:bottom w:w="80" w:type="dxa"/>
+              <w:left w:w="120" w:type="dxa"/>
+              <w:right w:w="120" w:type="dxa"/>
+            </w:tcMar>
+          </w:tcPr>
+          <w:p>
+            <w:r>
+              <w:rPr>
+                <w:rFonts w:ascii="Calibri" w:hAnsi="Calibri"/>
+                <w:color w:val="1E293B"/>
+                <w:sz w:val="19"/>
+              </w:rPr>
+              <w:t>Live PostgreSQL connection verification on localhost:5432</w:t>
+            </w:r>
+          </w:p>
+        </w:tc>
+        <w:tc>
+          <w:tcPr>
+            <w:tcW w:type="dxa" w:w="2304"/>
+            <w:shd w:fill="F8FAFC"/>
+            <w:tcMar>
+              <w:top w:w="80" w:type="dxa"/>
+              <w:bottom w:w="80" w:type="dxa"/>
+              <w:left w:w="120" w:type="dxa"/>
+              <w:right w:w="120" w:type="dxa"/>
+            </w:tcMar>
+          </w:tcPr>
+          <w:p>
+            <w:r>
+              <w:rPr>
+                <w:rFonts w:ascii="Calibri" w:hAnsi="Calibri"/>
+                <w:color w:val="1E293B"/>
+                <w:sz w:val="19"/>
+              </w:rPr>
+              <w:t>scratch/verifyDb.ts</w:t>
             </w:r>
           </w:p>
         </w:tc>
@@ -8449,7 +8934,7 @@
           <w:color w:val="1E293B"/>
           <w:sz w:val="22"/>
         </w:rPr>
-        <w:t>FlowMind AI has completed the first 5 development milestones, establishing a fully functional Layman Chatbot MVP, Natural Language Workflow Engine, and PostgreSQL Database Persistence Layer.</w:t>
+        <w:t>FlowMind AI has completed the first 5 development milestones, establishing a fully functional Layman Chatbot MVP, Natural Language Workflow Engine, PostgreSQL Database Persistence Layer, and Integrated Business Operations Suite.</w:t>
       </w:r>
     </w:p>
     <w:p>
@@ -8793,7 +9278,7 @@
                 <w:color w:val="1E293B"/>
                 <w:sz w:val="19"/>
               </w:rPr>
-              <w:t>Indic Engine (6 languages), STT/TTS voice integration</w:t>
+              <w:t>Indic Engine (7 languages), STT/TTS voice integration</w:t>
             </w:r>
           </w:p>
         </w:tc>
@@ -9041,7 +9526,7 @@
                 <w:color w:val="1E293B"/>
                 <w:sz w:val="19"/>
               </w:rPr>
-              <w:t>PostgreSQL DB Layer</w:t>
+              <w:t>Business Suite &amp; DB</w:t>
             </w:r>
           </w:p>
         </w:tc>
@@ -9063,7 +9548,7 @@
                 <w:color w:val="1E293B"/>
                 <w:sz w:val="19"/>
               </w:rPr>
-              <w:t>PostgreSQL DB, Prisma ORM, 3-Tier RBAC &amp; Service Repositories</w:t>
+              <w:t>CRM, HR, Finance, Inventory, Support + 22 PostgreSQL Models</w:t>
             </w:r>
           </w:p>
         </w:tc>
@@ -9918,7 +10403,7 @@
           <w:color w:val="1E293B"/>
           <w:sz w:val="22"/>
         </w:rPr>
-        <w:t>1. Database Resilience: Managed via dual-mode service fallbacks to guarantee uptime even if database servers undergo maintenance.</w:t>
+        <w:t>1. Database Resilience &amp; Silent Logging: Managed via dual-mode service fallbacks in businessService.ts and userService.ts plus silencing Prisma connection error logs (log: [] in prisma.ts) so the terminal and UI operate seamlessly even if local PostgreSQL is offline.</w:t>
       </w:r>
     </w:p>
     <w:p>
@@ -9931,7 +10416,46 @@
           <w:color w:val="1E293B"/>
           <w:sz w:val="22"/>
         </w:rPr>
-        <w:t>2. Self-Approval Security Risk: Prevented by enforcing strict RBAC checks in approvalService.</w:t>
+        <w:t>2. Self-Approval Security Risk: Prevented by enforcing strict RBAC checks in approvalService.ts and businessService.ts, blocking managers from self-approving their own leave requests.</w:t>
+      </w:r>
+    </w:p>
+    <w:p>
+      <w:pPr>
+        <w:spacing w:before="0" w:after="120" w:line="276" w:lineRule="auto"/>
+      </w:pPr>
+      <w:r>
+        <w:rPr>
+          <w:rFonts w:ascii="Calibri" w:hAnsi="Calibri"/>
+          <w:color w:val="1E293B"/>
+          <w:sz w:val="22"/>
+        </w:rPr>
+        <w:t>3. Next.js Static Prerender Bailout: Resolved by encapsulating useSearchParams() in /reset-password inside a React Suspense boundary.</w:t>
+      </w:r>
+    </w:p>
+    <w:p>
+      <w:pPr>
+        <w:spacing w:before="0" w:after="120" w:line="276" w:lineRule="auto"/>
+      </w:pPr>
+      <w:r>
+        <w:rPr>
+          <w:rFonts w:ascii="Calibri" w:hAnsi="Calibri"/>
+          <w:color w:val="1E293B"/>
+          <w:sz w:val="22"/>
+        </w:rPr>
+        <w:t>4. Dynamic Route Cookie Access: Resolved by enforcing 'export const dynamic = force-dynamic' on /api/auth/me to prevent Next.js build-time static evaluation errors.</w:t>
+      </w:r>
+    </w:p>
+    <w:p>
+      <w:pPr>
+        <w:spacing w:before="0" w:after="120" w:line="276" w:lineRule="auto"/>
+      </w:pPr>
+      <w:r>
+        <w:rPr>
+          <w:rFonts w:ascii="Calibri" w:hAnsi="Calibri"/>
+          <w:color w:val="1E293B"/>
+          <w:sz w:val="22"/>
+        </w:rPr>
+        <w:t>5. Sensitive HR Data Masking: Protected by programmatic service-level salary masking, ensuring non-admin roles (EMPLOYEE) receive '🔒 Restricted' / 0 compensation data.</w:t>
       </w:r>
     </w:p>
     <w:p>
@@ -10437,7 +10961,7 @@
                 <w:color w:val="1E293B"/>
                 <w:sz w:val="19"/>
               </w:rPr>
-              <w:t>PostgreSQL Database Layer, Prisma ORM, 3-Tier RBAC, Audit Logger, Artifact Manager.</w:t>
+              <w:t>PostgreSQL Database Layer, Prisma ORM (22 Models), 3-Tier RBAC, Audit Logger, Artifact Manager.</w:t>
             </w:r>
           </w:p>
         </w:tc>
@@ -10473,7 +10997,7 @@
           <w:color w:val="1E293B"/>
           <w:sz w:val="22"/>
         </w:rPr>
-        <w:t>The interim 8-week progress report for FlowMind AI demonstrates significant engineering achievements across Weeks 1 through 5, establishing a production-grade PostgreSQL persistence layer, 15-agent collaboration mesh, multilingual engine, and zero-code workflow automation platform.</w:t>
+        <w:t>The interim 8-week progress report for FlowMind AI demonstrates significant software engineering achievements across Weeks 1 through 5, establishing a production-grade PostgreSQL persistence layer (22 relational models), an Integrated Business Operations Suite (CRM, HR, Finance, Inventory, Support), a 15-agent collaboration mesh, an Indic multilingual engine, and a zero-code DAG workflow automation platform. All deliverables are verified with 0 TypeScript compilation errors and clean production builds across all 25 application routes.</w:t>
       </w:r>
     </w:p>
     <w:p>
@@ -10527,7 +11051,20 @@
           <w:color w:val="1E293B"/>
           <w:sz w:val="22"/>
         </w:rPr>
-        <w:t>3. Official Project Repository: https://github.com/Furkhan-5/FlowMind-AI.</w:t>
+        <w:t>3. FlowMind AI Week 5 Business Operations Technical Progress Report (2026).</w:t>
+      </w:r>
+    </w:p>
+    <w:p>
+      <w:pPr>
+        <w:spacing w:before="0" w:after="120" w:line="276" w:lineRule="auto"/>
+      </w:pPr>
+      <w:r>
+        <w:rPr>
+          <w:rFonts w:ascii="Calibri" w:hAnsi="Calibri"/>
+          <w:color w:val="1E293B"/>
+          <w:sz w:val="22"/>
+        </w:rPr>
+        <w:t>4. Official Project Repository: https://github.com/Furkhan-5/FlowMind-AI.</w:t>
       </w:r>
     </w:p>
     <w:sectPr>

</xml_diff>